<commit_message>
Docs: Scrub candidate credentials and update legacy brand references in engineering journal
</commit_message>
<xml_diff>
--- a/Documentation/Engineering_journal.docx
+++ b/Documentation/Engineering_journal.docx
@@ -5,26 +5,12 @@
     <w:p>
       <w:pPr>
         <w:rPr>
-          <w:sz w:val="24"/>
-          <w:szCs w:val="24"/>
-        </w:rPr>
-      </w:pPr>
-      <w:r>
-        <w:rPr>
           <w:b/>
           <w:bCs/>
           <w:sz w:val="24"/>
           <w:szCs w:val="24"/>
         </w:rPr>
-        <w:t xml:space="preserve">Candidate: </w:t>
-      </w:r>
-      <w:r>
-        <w:rPr>
-          <w:sz w:val="24"/>
-          <w:szCs w:val="24"/>
-        </w:rPr>
-        <w:t>Sai Krishna Potnuri</w:t>
-      </w:r>
+      </w:pPr>
       <w:r>
         <w:rPr>
           <w:b/>
@@ -32,16 +18,9 @@
           <w:sz w:val="24"/>
           <w:szCs w:val="24"/>
         </w:rPr>
-        <w:br/>
-        <w:t xml:space="preserve">Position: </w:t>
-      </w:r>
-      <w:r>
-        <w:rPr>
-          <w:sz w:val="24"/>
-          <w:szCs w:val="24"/>
-        </w:rPr>
-        <w:t>Consumer Data Analyst</w:t>
-      </w:r>
+        <w:t xml:space="preserve">Project: </w:t>
+      </w:r>
+      <w:proofErr w:type="spellStart"/>
       <w:r>
         <w:rPr>
           <w:b/>
@@ -49,24 +28,17 @@
           <w:sz w:val="24"/>
           <w:szCs w:val="24"/>
         </w:rPr>
-        <w:br/>
-        <w:t xml:space="preserve">Project: </w:t>
-      </w:r>
-      <w:proofErr w:type="spellStart"/>
-      <w:r>
-        <w:rPr>
-          <w:sz w:val="24"/>
-          <w:szCs w:val="24"/>
-        </w:rPr>
-        <w:t>Lunavale</w:t>
+        <w:t>AuraGlow</w:t>
       </w:r>
       <w:proofErr w:type="spellEnd"/>
       <w:r>
         <w:rPr>
-          <w:sz w:val="24"/>
-          <w:szCs w:val="24"/>
-        </w:rPr>
-        <w:t xml:space="preserve"> Skin Performance &amp; Retention Audit</w:t>
+          <w:b/>
+          <w:bCs/>
+          <w:sz w:val="24"/>
+          <w:szCs w:val="24"/>
+        </w:rPr>
+        <w:t xml:space="preserve"> Organics Performance &amp; Retention Audit</w:t>
       </w:r>
     </w:p>
     <w:p>
@@ -469,7 +441,7 @@
           <w:szCs w:val="24"/>
         </w:rPr>
         <w:pict w14:anchorId="4152E0F9">
-          <v:rect id="_x0000_i1145" style="width:0;height:1.5pt" o:hralign="center" o:hrstd="t" o:hr="t" fillcolor="#a0a0a0" stroked="f"/>
+          <v:rect id="_x0000_i1025" style="width:0;height:1.5pt" o:hralign="center" o:hrstd="t" o:hr="t" fillcolor="#a0a0a0" stroked="f"/>
         </w:pict>
       </w:r>
     </w:p>
@@ -533,15 +505,7 @@
           <w:sz w:val="24"/>
           <w:szCs w:val="24"/>
         </w:rPr>
-        <w:t xml:space="preserve"> (March 1 to March 31, 2026) was established to evaluate the campaign. This period perfectly encapsulates the active lifecycle of the promotion as defined in the company </w:t>
-      </w:r>
-      <w:r>
-        <w:rPr>
-          <w:sz w:val="24"/>
-          <w:szCs w:val="24"/>
-        </w:rPr>
-        <w:lastRenderedPageBreak/>
-        <w:t>calendar, providing a clean comparison before long-term customer retention or purchase-hangover effects occur.</w:t>
+        <w:t xml:space="preserve"> (March 1 to March 31, 2026) was established to evaluate the campaign. This period perfectly encapsulates the active lifecycle of the promotion as defined in the company calendar, providing a clean comparison before long-term customer retention or purchase-hangover effects occur.</w:t>
       </w:r>
     </w:p>
     <w:p>
@@ -562,6 +526,7 @@
           <w:sz w:val="24"/>
           <w:szCs w:val="24"/>
         </w:rPr>
+        <w:lastRenderedPageBreak/>
         <w:t>Geographic Baseline Equivalency:</w:t>
       </w:r>
       <w:r>
@@ -585,7 +550,7 @@
           <w:szCs w:val="24"/>
         </w:rPr>
         <w:pict w14:anchorId="238D8222">
-          <v:rect id="_x0000_i1146" style="width:0;height:1.5pt" o:hralign="center" o:hrstd="t" o:hr="t" fillcolor="#a0a0a0" stroked="f"/>
+          <v:rect id="_x0000_i1026" style="width:0;height:1.5pt" o:hralign="center" o:hrstd="t" o:hr="t" fillcolor="#a0a0a0" stroked="f"/>
         </w:pict>
       </w:r>
     </w:p>
@@ -718,7 +683,7 @@
           <w:szCs w:val="24"/>
         </w:rPr>
         <w:pict w14:anchorId="06C60562">
-          <v:rect id="_x0000_i1147" style="width:0;height:1.5pt" o:hralign="center" o:hrstd="t" o:hr="t" fillcolor="#a0a0a0" stroked="f"/>
+          <v:rect id="_x0000_i1027" style="width:0;height:1.5pt" o:hralign="center" o:hrstd="t" o:hr="t" fillcolor="#a0a0a0" stroked="f"/>
         </w:pict>
       </w:r>
     </w:p>
@@ -798,7 +763,7 @@
           <w:szCs w:val="24"/>
         </w:rPr>
         <w:pict w14:anchorId="75C92876">
-          <v:rect id="_x0000_i1148" style="width:0;height:1.5pt" o:hralign="center" o:hrstd="t" o:hr="t" fillcolor="#a0a0a0" stroked="f"/>
+          <v:rect id="_x0000_i1028" style="width:0;height:1.5pt" o:hralign="center" o:hrstd="t" o:hr="t" fillcolor="#a0a0a0" stroked="f"/>
         </w:pict>
       </w:r>
     </w:p>
@@ -919,31 +884,38 @@
           <w:sz w:val="24"/>
           <w:szCs w:val="24"/>
         </w:rPr>
+        <w:t>Timestamp Filter Optimization:</w:t>
+      </w:r>
+      <w:r>
+        <w:rPr>
+          <w:sz w:val="24"/>
+          <w:szCs w:val="24"/>
+        </w:rPr>
+        <w:t xml:space="preserve"> Initial AI-generated query structures applied a standard WHERE </w:t>
+      </w:r>
+      <w:proofErr w:type="spellStart"/>
+      <w:r>
+        <w:rPr>
+          <w:sz w:val="24"/>
+          <w:szCs w:val="24"/>
+        </w:rPr>
+        <w:t>order_ts</w:t>
+      </w:r>
+      <w:proofErr w:type="spellEnd"/>
+      <w:r>
+        <w:rPr>
+          <w:sz w:val="24"/>
+          <w:szCs w:val="24"/>
+        </w:rPr>
+        <w:t xml:space="preserve"> BETWEEN '2026-03-01' AND '2026-03-31' filter. I audited this logic and corrected it to &gt;= '2026-03-01' AND &lt; '2026-04-01'. Because database </w:t>
+      </w:r>
+      <w:r>
+        <w:rPr>
+          <w:sz w:val="24"/>
+          <w:szCs w:val="24"/>
+        </w:rPr>
         <w:lastRenderedPageBreak/>
-        <w:t>Timestamp Filter Optimization:</w:t>
-      </w:r>
-      <w:r>
-        <w:rPr>
-          <w:sz w:val="24"/>
-          <w:szCs w:val="24"/>
-        </w:rPr>
-        <w:t xml:space="preserve"> Initial AI-generated query structures applied a standard WHERE </w:t>
-      </w:r>
-      <w:proofErr w:type="spellStart"/>
-      <w:r>
-        <w:rPr>
-          <w:sz w:val="24"/>
-          <w:szCs w:val="24"/>
-        </w:rPr>
-        <w:t>order_ts</w:t>
-      </w:r>
-      <w:proofErr w:type="spellEnd"/>
-      <w:r>
-        <w:rPr>
-          <w:sz w:val="24"/>
-          <w:szCs w:val="24"/>
-        </w:rPr>
-        <w:t xml:space="preserve"> BETWEEN '2026-03-01' AND '2026-03-31' filter. I audited this logic and corrected it to &gt;= '2026-03-01' AND &lt; '2026-04-01'. Because database engines expand a standalone date string to midnight (00:00:00), using BETWEEN would completely drop any sales transactions that occurred during the final 24 hours of March 31st, causing an undercount of an entire day's worth of business revenue.</w:t>
+        <w:t>engines expand a standalone date string to midnight (00:00:00), using BETWEEN would completely drop any sales transactions that occurred during the final 24 hours of March 31st, causing an undercount of an entire day's worth of business revenue.</w:t>
       </w:r>
     </w:p>
     <w:p>
@@ -1173,7 +1145,7 @@
           <w:szCs w:val="24"/>
         </w:rPr>
         <w:pict w14:anchorId="412228FC">
-          <v:rect id="_x0000_i1149" style="width:0;height:1.5pt" o:hralign="center" o:hrstd="t" o:hr="t" fillcolor="#a0a0a0" stroked="f"/>
+          <v:rect id="_x0000_i1029" style="width:0;height:1.5pt" o:hralign="center" o:hrstd="t" o:hr="t" fillcolor="#a0a0a0" stroked="f"/>
         </w:pict>
       </w:r>
     </w:p>

</xml_diff>

<commit_message>
Docs & Presentation: Complete final sweep of brand renaming and credential anonymization
</commit_message>
<xml_diff>
--- a/Documentation/Engineering_journal.docx
+++ b/Documentation/Engineering_journal.docx
@@ -838,10 +838,40 @@
           <w:sz w:val="24"/>
           <w:szCs w:val="24"/>
         </w:rPr>
-        <w:t>lunavale.duckdb</w:t>
+        <w:t>a</w:t>
+      </w:r>
+      <w:r>
+        <w:rPr>
+          <w:sz w:val="24"/>
+          <w:szCs w:val="24"/>
+        </w:rPr>
+        <w:t>uraglow</w:t>
       </w:r>
       <w:proofErr w:type="spellEnd"/>
+      <w:r>
+        <w:rPr>
+          <w:sz w:val="24"/>
+          <w:szCs w:val="24"/>
+        </w:rPr>
+        <w:t>.</w:t>
+      </w:r>
+      <w:r>
+        <w:rPr>
+          <w:sz w:val="24"/>
+          <w:szCs w:val="24"/>
+        </w:rPr>
+        <w:t>.</w:t>
+      </w:r>
+      <w:proofErr w:type="spellStart"/>
       <w:proofErr w:type="gramEnd"/>
+      <w:r>
+        <w:rPr>
+          <w:sz w:val="24"/>
+          <w:szCs w:val="24"/>
+        </w:rPr>
+        <w:t>duckdb</w:t>
+      </w:r>
+      <w:proofErr w:type="spellEnd"/>
       <w:r>
         <w:rPr>
           <w:sz w:val="24"/>

</xml_diff>